<commit_message>
Shorten Word version of the DSCR article to one page
Co-Authored-By: Claude Opus 5.5 <noreply@anthropic.com>
Claude-Session: https://claude.ai/code/session_012cVfqaFhuADaYqB8NmXAwj
</commit_message>
<xml_diff>
--- a/assets/what-is-a-dscr-loan.docx
+++ b/assets/what-is-a-dscr-loan.docx
@@ -4,7 +4,7 @@
   <w:body>
     <w:tbl>
       <w:tblPr>
-        <w:tblW w:type="dxa" w:w="9360"/>
+        <w:tblW w:type="dxa" w:w="10080"/>
         <w:tblBorders>
           <w:top w:val="none" w:color="FFFFFF" w:sz="0"/>
           <w:left w:val="none" w:color="FFFFFF" w:sz="0"/>
@@ -15,13 +15,13 @@
         </w:tblBorders>
       </w:tblPr>
       <w:tblGrid>
-        <w:gridCol w:w="1560"/>
-        <w:gridCol w:w="7800"/>
+        <w:gridCol w:w="1300"/>
+        <w:gridCol w:w="8780"/>
       </w:tblGrid>
       <w:tr>
         <w:tc>
           <w:tcPr>
-            <w:tcW w:type="dxa" w:w="1560"/>
+            <w:tcW w:type="dxa" w:w="1300"/>
             <w:tcBorders>
               <w:top w:val="none" w:color="FFFFFF" w:sz="0"/>
               <w:left w:val="none" w:color="FFFFFF" w:sz="0"/>
@@ -37,7 +37,7 @@
             <w:r>
               <w:drawing>
                 <wp:inline distT="0" distB="0" distL="0" distR="0">
-                  <wp:extent cx="819150" cy="857250"/>
+                  <wp:extent cx="647700" cy="685800"/>
                   <wp:effectExtent t="0" r="0" b="0" l="0"/>
                   <wp:docPr id="1" name="headshot" descr="Tracy Freeman headshot" title="Tracy Freeman"/>
                   <wp:cNvGraphicFramePr>
@@ -62,7 +62,7 @@
                         <pic:spPr bwMode="auto">
                           <a:xfrm>
                             <a:off x="0" y="0"/>
-                            <a:ext cx="819150" cy="857250"/>
+                            <a:ext cx="647700" cy="685800"/>
                           </a:xfrm>
                           <a:prstGeom prst="rect">
                             <a:avLst/>
@@ -78,7 +78,7 @@
         </w:tc>
         <w:tc>
           <w:tcPr>
-            <w:tcW w:type="dxa" w:w="7800"/>
+            <w:tcW w:type="dxa" w:w="8780"/>
             <w:tcBorders>
               <w:top w:val="none" w:color="FFFFFF" w:sz="0"/>
               <w:left w:val="none" w:color="FFFFFF" w:sz="0"/>
@@ -159,23 +159,15 @@
         <w:pBdr>
           <w:bottom w:val="single" w:color="1E8A86" w:sz="18" w:space="1"/>
         </w:pBdr>
-        <w:spacing w:after="280" w:before="160"/>
-      </w:pPr>
-    </w:p>
-    <w:p>
-      <w:pPr>
-        <w:spacing w:after="160"/>
-      </w:pPr>
-      <w:r>
-        <w:t xml:space="preserve">If you've ever tried to finance a rental property with a traditional mortgage, you know the drill: W-2s, two years of tax returns, pay stubs and a deep dive into your personal income. For many self-employed investors, or anyone whose tax returns show plenty of write-offs, that process can stop a good deal in its tracks.</w:t>
-      </w:r>
-    </w:p>
-    <w:p>
-      <w:pPr>
-        <w:spacing w:after="160"/>
-      </w:pPr>
-      <w:r>
-        <w:t xml:space="preserve">That's where a DSCR loan comes in.</w:t>
+        <w:spacing w:after="160" w:before="80"/>
+      </w:pPr>
+    </w:p>
+    <w:p>
+      <w:pPr>
+        <w:spacing w:after="100"/>
+      </w:pPr>
+      <w:r>
+        <w:t xml:space="preserve">If you've tried to finance a rental with a traditional mortgage, you know the drill: W-2s, two years of tax returns, pay stubs and a deep dive into your personal income. For self-employed investors, or anyone whose returns show plenty of write-offs, that can stop a good deal in its tracks. That's where a DSCR loan comes in.</w:t>
       </w:r>
     </w:p>
     <w:p>
@@ -188,7 +180,7 @@
     </w:p>
     <w:p>
       <w:pPr>
-        <w:spacing w:after="160"/>
+        <w:spacing w:after="100"/>
       </w:pPr>
       <w:r>
         <w:t xml:space="preserve">DSCR stands for </w:t>
@@ -226,20 +218,12 @@
     </w:p>
     <w:p>
       <w:pPr>
-        <w:spacing w:after="160"/>
-      </w:pPr>
-      <w:r>
-        <w:t xml:space="preserve">The math is simple:</w:t>
-      </w:r>
-    </w:p>
-    <w:p>
-      <w:pPr>
         <w:pBdr>
-          <w:top w:val="single" w:color="E3F3F1" w:sz="24" w:space="6"/>
-          <w:bottom w:val="single" w:color="E3F3F1" w:sz="24" w:space="6"/>
+          <w:top w:val="single" w:color="E3F3F1" w:sz="24" w:space="4"/>
+          <w:bottom w:val="single" w:color="E3F3F1" w:sz="24" w:space="4"/>
         </w:pBdr>
         <w:shd w:fill="E3F3F1" w:color="auto" w:val="clear"/>
-        <w:spacing w:after="240" w:before="120"/>
+        <w:spacing w:after="160" w:before="60"/>
         <w:jc w:val="center"/>
       </w:pPr>
       <w:r>
@@ -252,22 +236,10 @@
     </w:p>
     <w:p>
       <w:pPr>
-        <w:spacing w:after="160"/>
-      </w:pPr>
-      <w:r>
-        <w:t xml:space="preserve">The housing payment includes principal, interest, property taxes, insurance and any HOA dues. If a property rents for $2,400 a month and the full payment is $2,000, the DSCR is 1.2. The property brings in 20% more than it costs to carry. A ratio of 1.0 means the rent covers the payment exactly. Requirements vary by lender and program, which is why it pays to work with someone who knows which programs fit your numbers. You can run your own numbers with the </w:t>
-      </w:r>
-      <w:hyperlink w:history="1" r:id="rIdy25t1_1xycnimow6l8zmh">
-        <w:r>
-          <w:rPr>
-            <w:color w:val="1E8A86"/>
-            <w:u w:val="single"/>
-          </w:rPr>
-          <w:t xml:space="preserve">DSCR calculator</w:t>
-        </w:r>
-      </w:hyperlink>
-      <w:r>
-        <w:t xml:space="preserve">.</w:t>
+        <w:spacing w:after="100"/>
+      </w:pPr>
+      <w:r>
+        <w:t xml:space="preserve">The payment includes principal, interest, taxes, insurance and any HOA dues. If a property rents for $2,400 a month and the payment is $2,000, the DSCR is 1.2: the property brings in 20% more than it costs to carry. A ratio of 1.0 means the rent covers the payment exactly. Requirements vary by lender and program, so it pays to work with someone who knows which programs fit your numbers.</w:t>
       </w:r>
     </w:p>
     <w:p>
@@ -280,11 +252,8 @@
     </w:p>
     <w:p>
       <w:pPr>
-        <w:spacing w:after="160"/>
-      </w:pPr>
-      <w:r>
-        <w:t xml:space="preserve">This is the biggest reason investors love DSCR financing. </w:t>
-      </w:r>
+        <w:spacing w:after="100"/>
+      </w:pPr>
       <w:r>
         <w:rPr>
           <w:b/>
@@ -303,7 +272,7 @@
           <w:ilvl w:val="0"/>
           <w:numId w:val="2"/>
         </w:numPr>
-        <w:spacing w:after="80"/>
+        <w:spacing w:after="40"/>
       </w:pPr>
       <w:r>
         <w:rPr>
@@ -323,7 +292,7 @@
           <w:ilvl w:val="0"/>
           <w:numId w:val="2"/>
         </w:numPr>
-        <w:spacing w:after="80"/>
+        <w:spacing w:after="40"/>
       </w:pPr>
       <w:r>
         <w:rPr>
@@ -343,288 +312,189 @@
           <w:ilvl w:val="0"/>
           <w:numId w:val="2"/>
         </w:numPr>
+        <w:spacing w:after="40"/>
+      </w:pPr>
+      <w:r>
+        <w:rPr>
+          <w:b/>
+          <w:bCs/>
+        </w:rPr>
+        <w:t xml:space="preserve">Growing investors</w:t>
+      </w:r>
+      <w:r>
+        <w:t xml:space="preserve"> who have reached the limits of conventional financing</w:t>
+      </w:r>
+    </w:p>
+    <w:p>
+      <w:pPr>
+        <w:pStyle w:val="Heading2"/>
+      </w:pPr>
+      <w:r>
+        <w:t xml:space="preserve">More than single-family homes</w:t>
+      </w:r>
+    </w:p>
+    <w:p>
+      <w:pPr>
+        <w:spacing w:after="100"/>
+      </w:pPr>
+      <w:r>
+        <w:t xml:space="preserve">DSCR loans work for single-family homes, condos, townhomes and small multifamily properties. </w:t>
+      </w:r>
+      <w:r>
+        <w:rPr>
+          <w:b/>
+          <w:bCs/>
+        </w:rPr>
+        <w:t xml:space="preserve">DSCR financing is available for properties up to 10 units</w:t>
+      </w:r>
+      <w:r>
+        <w:t xml:space="preserve">, giving you room to grow into a real portfolio. Use one to buy a rental, take cash out for your next deal, or refinance out of a fix and flip loan once the property is renovated and rented.</w:t>
+      </w:r>
+    </w:p>
+    <w:p>
+      <w:pPr>
+        <w:pStyle w:val="Heading2"/>
+      </w:pPr>
+      <w:r>
+        <w:t xml:space="preserve">Investing beyond your backyard</w:t>
+      </w:r>
+    </w:p>
+    <w:p>
+      <w:pPr>
+        <w:spacing w:after="100"/>
+      </w:pPr>
+      <w:r>
+        <w:t xml:space="preserve">Tracy the Mortgage Lady can originate </w:t>
+      </w:r>
+      <w:r>
+        <w:rPr>
+          <w:b/>
+          <w:bCs/>
+        </w:rPr>
+        <w:t xml:space="preserve">DSCR loans in most states</w:t>
+      </w:r>
+      <w:r>
+        <w:t xml:space="preserve">. Whether you're buying in Central Florida or across the country, you can work with one trusted loan officer as your portfolio grows.</w:t>
+      </w:r>
+    </w:p>
+    <w:p>
+      <w:pPr>
+        <w:pStyle w:val="Heading2"/>
+      </w:pPr>
+      <w:r>
+        <w:t xml:space="preserve">There is no one-size-fits-all loan</w:t>
+      </w:r>
+    </w:p>
+    <w:p>
+      <w:pPr>
+        <w:spacing w:after="100"/>
+      </w:pPr>
+      <w:r>
+        <w:t xml:space="preserve">A DSCR loan may be right for one property, while bank statement financing or a fix and flip loan may suit the next. </w:t>
+      </w:r>
+      <w:r>
+        <w:rPr>
+          <w:b/>
+          <w:bCs/>
+        </w:rPr>
+        <w:t xml:space="preserve">There are more options for your real estate strategy</w:t>
+      </w:r>
+      <w:r>
+        <w:t xml:space="preserve"> than most people realize. Tracy Freeman is a real estate investor herself and a former nurse, and she'll take the time to understand your goals and match you with the program that fits.</w:t>
+      </w:r>
+    </w:p>
+    <w:p>
+      <w:pPr>
+        <w:pBdr>
+          <w:top w:val="single" w:color="13304F" w:sz="36" w:space="4"/>
+          <w:bottom w:val="single" w:color="13304F" w:sz="36" w:space="4"/>
+        </w:pBdr>
+        <w:shd w:fill="13304F" w:color="auto" w:val="clear"/>
+        <w:spacing w:after="100" w:before="140"/>
+        <w:ind w:left="200" w:right="200"/>
+      </w:pPr>
+      <w:r>
+        <w:rPr>
+          <w:rFonts w:ascii="Georgia" w:cs="Georgia" w:eastAsia="Georgia" w:hAnsi="Georgia"/>
+          <w:b/>
+          <w:bCs/>
+          <w:color w:val="FFFFFF"/>
+          <w:sz w:val="24"/>
+          <w:szCs w:val="24"/>
+        </w:rPr>
+        <w:t xml:space="preserve">Call or text Tracy: 352-223-0712</w:t>
+      </w:r>
+      <w:r>
+        <w:rPr>
+          <w:color w:val="FFFFFF"/>
+          <w:sz w:val="18"/>
+          <w:szCs w:val="18"/>
+        </w:rPr>
+        <w:t xml:space="preserve">   tracymortgagelady.com</w:t>
+      </w:r>
+    </w:p>
+    <w:p>
+      <w:pPr>
+        <w:pBdr>
+          <w:top w:val="single" w:color="E4E0D8" w:sz="4" w:space="4"/>
+        </w:pBdr>
+        <w:spacing w:after="40" w:before="60"/>
+      </w:pPr>
+      <w:r>
+        <w:rPr>
+          <w:b/>
+          <w:bCs/>
+          <w:color w:val="5C6878"/>
+          <w:sz w:val="14"/>
+          <w:szCs w:val="14"/>
+        </w:rPr>
+        <w:t xml:space="preserve">Tracy Freeman</w:t>
+      </w:r>
+      <w:r>
+        <w:rPr>
+          <w:color w:val="5C6878"/>
+          <w:sz w:val="14"/>
+          <w:szCs w:val="14"/>
+        </w:rPr>
+        <w:t xml:space="preserve">, Mortgage Loan Originator, NMLS #2174804  |  </w:t>
+      </w:r>
+      <w:r>
+        <w:rPr>
+          <w:b/>
+          <w:bCs/>
+          <w:color w:val="5C6878"/>
+          <w:sz w:val="14"/>
+          <w:szCs w:val="14"/>
+        </w:rPr>
+        <w:t xml:space="preserve">Mpire Financial Group LLC</w:t>
+      </w:r>
+      <w:r>
+        <w:rPr>
+          <w:color w:val="5C6878"/>
+          <w:sz w:val="14"/>
+          <w:szCs w:val="14"/>
+        </w:rPr>
+        <w:t xml:space="preserve">, NMLS #2108504  |  120 South Dillard Street, Winter Garden, FL 34787</w:t>
+      </w:r>
+    </w:p>
+    <w:p>
+      <w:pPr>
         <w:spacing w:after="80"/>
       </w:pPr>
       <w:r>
         <w:rPr>
-          <w:b/>
-          <w:bCs/>
-        </w:rPr>
-        <w:t xml:space="preserve">Growing investors</w:t>
-      </w:r>
-      <w:r>
-        <w:t xml:space="preserve"> who have reached the limits of conventional financing</w:t>
-      </w:r>
-    </w:p>
-    <w:p>
-      <w:pPr>
-        <w:pStyle w:val="ListParagraph"/>
-        <w:numPr>
-          <w:ilvl w:val="0"/>
-          <w:numId w:val="2"/>
-        </w:numPr>
-        <w:spacing w:after="80"/>
-      </w:pPr>
-      <w:r>
-        <w:rPr>
-          <w:b/>
-          <w:bCs/>
-        </w:rPr>
-        <w:t xml:space="preserve">Anyone who wants a faster, simpler process</w:t>
-      </w:r>
-      <w:r>
-        <w:t xml:space="preserve"> without stacks of personal income paperwork</w:t>
-      </w:r>
-    </w:p>
-    <w:p>
-      <w:pPr>
-        <w:pStyle w:val="Heading2"/>
-      </w:pPr>
-      <w:r>
-        <w:t xml:space="preserve">More than single-family homes</w:t>
-      </w:r>
-    </w:p>
-    <w:p>
-      <w:pPr>
-        <w:spacing w:after="160"/>
-      </w:pPr>
-      <w:r>
-        <w:t xml:space="preserve">DSCR loans aren't limited to one rental house. They can be used for single-family homes, condos, townhomes and small multifamily properties. </w:t>
-      </w:r>
-      <w:r>
-        <w:rPr>
-          <w:b/>
-          <w:bCs/>
-        </w:rPr>
-        <w:t xml:space="preserve">DSCR financing is available for properties up to 10 units</w:t>
-      </w:r>
-      <w:r>
-        <w:t xml:space="preserve">, which gives you room to grow from your first rental into a real portfolio.</w:t>
-      </w:r>
-    </w:p>
-    <w:p>
-      <w:pPr>
-        <w:spacing w:after="160"/>
-      </w:pPr>
-      <w:r>
-        <w:t xml:space="preserve">They also fit several strategies. You can buy a new rental, do a cash-out refinance to pull equity for your next deal, or refinance out of a short-term </w:t>
-      </w:r>
-      <w:hyperlink w:history="1" r:id="rIdb8hz4hcoahzsxtsujfr0e">
+          <w:color w:val="5C6878"/>
+          <w:sz w:val="14"/>
+          <w:szCs w:val="14"/>
+        </w:rPr>
+        <w:t xml:space="preserve">Not a commitment to lend. All loans are subject to credit approval, underwriting guidelines and property eligibility. Programs, rates, terms and conditions are subject to change without notice. Business-purpose investment property loans are available in most states; availability and requirements vary by state. Verify licensing at NMLS Consumer Access: </w:t>
+      </w:r>
+      <w:hyperlink w:history="1" r:id="rIdlllqu-r1grzh4uikpb8ov">
         <w:r>
           <w:rPr>
             <w:color w:val="1E8A86"/>
-            <w:u w:val="single"/>
-          </w:rPr>
-          <w:t xml:space="preserve">fix and flip loan</w:t>
-        </w:r>
-      </w:hyperlink>
-      <w:r>
-        <w:t xml:space="preserve"> once the property is renovated and rented.</w:t>
-      </w:r>
-    </w:p>
-    <w:p>
-      <w:pPr>
-        <w:pStyle w:val="Heading2"/>
-      </w:pPr>
-      <w:r>
-        <w:t xml:space="preserve">Investing beyond your backyard</w:t>
-      </w:r>
-    </w:p>
-    <w:p>
-      <w:pPr>
-        <w:spacing w:after="160"/>
-      </w:pPr>
-      <w:r>
-        <w:t xml:space="preserve">Many investors look for opportunities outside their home market. Tracy the Mortgage Lady can originate </w:t>
-      </w:r>
-      <w:r>
-        <w:rPr>
-          <w:b/>
-          <w:bCs/>
-        </w:rPr>
-        <w:t xml:space="preserve">DSCR loans in most states</w:t>
-      </w:r>
-      <w:r>
-        <w:t xml:space="preserve">. Whether you're buying in Central Florida or across the country, you can work with one trusted loan officer as your portfolio grows.</w:t>
-      </w:r>
-    </w:p>
-    <w:p>
-      <w:pPr>
-        <w:pStyle w:val="Heading2"/>
-      </w:pPr>
-      <w:r>
-        <w:t xml:space="preserve">There is no one-size-fits-all loan</w:t>
-      </w:r>
-    </w:p>
-    <w:p>
-      <w:pPr>
-        <w:spacing w:after="160"/>
-      </w:pPr>
-      <w:r>
-        <w:t xml:space="preserve">Every investor's goals are different, and so is every deal. A DSCR loan may be the right tool for one property, while </w:t>
-      </w:r>
-      <w:hyperlink w:history="1" r:id="rIdt1mcs8tvts_4h2d8dyiro">
-        <w:r>
-          <w:rPr>
-            <w:color w:val="1E8A86"/>
-            <w:u w:val="single"/>
-          </w:rPr>
-          <w:t xml:space="preserve">bank statement financing</w:t>
-        </w:r>
-      </w:hyperlink>
-      <w:r>
-        <w:t xml:space="preserve"> or a </w:t>
-      </w:r>
-      <w:hyperlink w:history="1" r:id="rIdjr_bnwiv18h4gahtivwp9">
-        <w:r>
-          <w:rPr>
-            <w:color w:val="1E8A86"/>
-            <w:u w:val="single"/>
-          </w:rPr>
-          <w:t xml:space="preserve">fix and flip loan</w:t>
-        </w:r>
-      </w:hyperlink>
-      <w:r>
-        <w:t xml:space="preserve"> may suit the next one better. </w:t>
-      </w:r>
-      <w:r>
-        <w:rPr>
-          <w:b/>
-          <w:bCs/>
-        </w:rPr>
-        <w:t xml:space="preserve">There are more options for your real estate strategy</w:t>
-      </w:r>
-      <w:r>
-        <w:t xml:space="preserve"> than most people realize.</w:t>
-      </w:r>
-    </w:p>
-    <w:p>
-      <w:pPr>
-        <w:spacing w:after="160"/>
-      </w:pPr>
-      <w:r>
-        <w:t xml:space="preserve">Tracy Freeman is a real estate investor herself and a former nurse. She brings care and attention to every client conversation. She'll take the time to understand your goals, review your numbers and match you with the program that fits.</w:t>
-      </w:r>
-    </w:p>
-    <w:p>
-      <w:pPr>
-        <w:spacing w:after="160"/>
-      </w:pPr>
-      <w:r>
-        <w:rPr>
-          <w:b/>
-          <w:bCs/>
-        </w:rPr>
-        <w:t xml:space="preserve">Ready to see if a DSCR loan works for your next property? Call or text Tracy at 352-223-0712.</w:t>
-      </w:r>
-      <w:r>
-        <w:t xml:space="preserve"> Or learn more about </w:t>
-      </w:r>
-      <w:hyperlink w:history="1" r:id="rIdrcfzfsaqpghvnoxeooq-s">
-        <w:r>
-          <w:rPr>
-            <w:color w:val="1E8A86"/>
-            <w:u w:val="single"/>
-          </w:rPr>
-          <w:t xml:space="preserve">DSCR loan programs</w:t>
-        </w:r>
-      </w:hyperlink>
-      <w:r>
-        <w:t xml:space="preserve">.</w:t>
-      </w:r>
-    </w:p>
-    <w:p>
-      <w:pPr>
-        <w:pBdr>
-          <w:top w:val="single" w:color="13304F" w:sz="48" w:space="8"/>
-          <w:bottom w:val="single" w:color="13304F" w:sz="48" w:space="8"/>
-        </w:pBdr>
-        <w:shd w:fill="13304F" w:color="auto" w:val="clear"/>
-        <w:spacing w:after="280" w:before="280"/>
-        <w:ind w:left="200" w:right="200"/>
-      </w:pPr>
-      <w:r>
-        <w:rPr>
-          <w:rFonts w:ascii="Georgia" w:cs="Georgia" w:eastAsia="Georgia" w:hAnsi="Georgia"/>
-          <w:b/>
-          <w:bCs/>
-          <w:color w:val="FFFFFF"/>
-          <w:sz w:val="28"/>
-          <w:szCs w:val="28"/>
-        </w:rPr>
-        <w:t xml:space="preserve">Call or text Tracy: 352-223-0712</w:t>
-      </w:r>
-      <w:r>
-        <w:rPr>
-          <w:color w:val="FFFFFF"/>
-          <w:sz w:val="20"/>
-          <w:szCs w:val="20"/>
-        </w:rPr>
-        <w:t xml:space="preserve">   tracymortgagelady.com</w:t>
-      </w:r>
-    </w:p>
-    <w:p>
-      <w:pPr>
-        <w:pBdr>
-          <w:top w:val="single" w:color="E4E0D8" w:sz="4" w:space="8"/>
-        </w:pBdr>
-        <w:spacing w:after="80" w:before="120"/>
-      </w:pPr>
-      <w:r>
-        <w:rPr>
-          <w:b/>
-          <w:bCs/>
-          <w:color w:val="5C6878"/>
-          <w:sz w:val="16"/>
-          <w:szCs w:val="16"/>
-        </w:rPr>
-        <w:t xml:space="preserve">Tracy Freeman</w:t>
-      </w:r>
-      <w:r>
-        <w:rPr>
-          <w:color w:val="5C6878"/>
-          <w:sz w:val="16"/>
-          <w:szCs w:val="16"/>
-        </w:rPr>
-        <w:t xml:space="preserve">, Mortgage Loan Originator, NMLS #2174804  |  </w:t>
-      </w:r>
-      <w:r>
-        <w:rPr>
-          <w:b/>
-          <w:bCs/>
-          <w:color w:val="5C6878"/>
-          <w:sz w:val="16"/>
-          <w:szCs w:val="16"/>
-        </w:rPr>
-        <w:t xml:space="preserve">Mpire Financial Group LLC</w:t>
-      </w:r>
-      <w:r>
-        <w:rPr>
-          <w:color w:val="5C6878"/>
-          <w:sz w:val="16"/>
-          <w:szCs w:val="16"/>
-        </w:rPr>
-        <w:t xml:space="preserve">, NMLS #2108504  |  120 South Dillard Street, Winter Garden, FL 34787</w:t>
-      </w:r>
-    </w:p>
-    <w:p>
-      <w:pPr>
-        <w:spacing w:after="80"/>
-      </w:pPr>
-      <w:r>
-        <w:rPr>
-          <w:color w:val="5C6878"/>
-          <w:sz w:val="16"/>
-          <w:szCs w:val="16"/>
-        </w:rPr>
-        <w:t xml:space="preserve">This is not a commitment to lend. All loans are subject to credit approval, underwriting guidelines and property eligibility. Programs, rates, terms and conditions are subject to change without notice. Business-purpose investment property loans are available in most states; availability and requirements vary by state. Verify licensing at NMLS Consumer Access: </w:t>
-      </w:r>
-      <w:hyperlink w:history="1" r:id="rIdrw9wdg_decpwezckpf4t9">
-        <w:r>
-          <w:rPr>
-            <w:color w:val="1E8A86"/>
-            <w:sz w:val="16"/>
-            <w:szCs w:val="16"/>
+            <w:sz w:val="14"/>
+            <w:szCs w:val="14"/>
             <w:u w:val="single"/>
           </w:rPr>
           <w:t xml:space="preserve">Tracy</w:t>
@@ -633,17 +503,17 @@
       <w:r>
         <w:rPr>
           <w:color w:val="5C6878"/>
-          <w:sz w:val="16"/>
-          <w:szCs w:val="16"/>
+          <w:sz w:val="14"/>
+          <w:szCs w:val="14"/>
         </w:rPr>
         <w:t xml:space="preserve"> and </w:t>
       </w:r>
-      <w:hyperlink w:history="1" r:id="rIds3badhal6_o3zayobkuwr">
+      <w:hyperlink w:history="1" r:id="rIdd5ej-rafxltzgcqulvvvw">
         <w:r>
           <w:rPr>
             <w:color w:val="1E8A86"/>
-            <w:sz w:val="16"/>
-            <w:szCs w:val="16"/>
+            <w:sz w:val="14"/>
+            <w:szCs w:val="14"/>
             <w:u w:val="single"/>
           </w:rPr>
           <w:t xml:space="preserve">Mpire</w:t>
@@ -652,31 +522,26 @@
       <w:r>
         <w:rPr>
           <w:color w:val="5C6878"/>
-          <w:sz w:val="16"/>
-          <w:szCs w:val="16"/>
-        </w:rPr>
-        <w:t xml:space="preserve">.</w:t>
-      </w:r>
-    </w:p>
-    <w:p>
-      <w:pPr>
-        <w:spacing w:after="80"/>
-      </w:pPr>
+          <w:sz w:val="14"/>
+          <w:szCs w:val="14"/>
+        </w:rPr>
+        <w:t xml:space="preserve">. </w:t>
+      </w:r>
       <w:r>
         <w:rPr>
           <w:b/>
           <w:bCs/>
           <w:color w:val="5C6878"/>
-          <w:sz w:val="16"/>
-          <w:szCs w:val="16"/>
-        </w:rPr>
-        <w:t xml:space="preserve">Equal Housing Opportunity</w:t>
+          <w:sz w:val="14"/>
+          <w:szCs w:val="14"/>
+        </w:rPr>
+        <w:t xml:space="preserve">Equal Housing Opportunity.</w:t>
       </w:r>
     </w:p>
     <w:sectPr>
       <w:footerReference w:type="default" r:id="rId7"/>
       <w:pgSz w:w="12240" w:h="15840" w:orient="portrait"/>
-      <w:pgMar w:top="1080" w:right="1440" w:bottom="1080" w:left="1440" w:header="708" w:footer="708" w:gutter="0"/>
+      <w:pgMar w:top="720" w:right="1080" w:bottom="720" w:left="1080" w:header="708" w:footer="708" w:gutter="0"/>
       <w:pgNumType/>
       <w:docGrid w:linePitch="360"/>
     </w:sectPr>
@@ -936,13 +801,13 @@
       <w:rPr>
         <w:rFonts w:ascii="Calibri" w:cs="Calibri" w:eastAsia="Calibri" w:hAnsi="Calibri"/>
         <w:color w:val="1F2733"/>
-        <w:sz w:val="22"/>
-        <w:szCs w:val="22"/>
+        <w:sz w:val="20"/>
+        <w:szCs w:val="20"/>
       </w:rPr>
     </w:rPrDefault>
     <w:pPrDefault>
       <w:pPr>
-        <w:spacing w:line="288"/>
+        <w:spacing w:line="264"/>
       </w:pPr>
     </w:pPrDefault>
   </w:docDefaults>
@@ -1128,8 +993,8 @@
       <w:b/>
       <w:bCs/>
       <w:color w:val="13304F"/>
-      <w:sz w:val="44"/>
-      <w:szCs w:val="44"/>
+      <w:sz w:val="38"/>
+      <w:szCs w:val="38"/>
     </w:rPr>
   </w:style>
   <w:style w:type="paragraph" w:styleId="Heading2">
@@ -1139,7 +1004,7 @@
     <w:qFormat/>
     <w:pPr>
       <w:keepNext/>
-      <w:spacing w:after="120" w:before="320"/>
+      <w:spacing w:after="60" w:before="160"/>
       <w:outlineLvl w:val="1"/>
     </w:pPr>
     <w:rPr>
@@ -1147,8 +1012,8 @@
       <w:b/>
       <w:bCs/>
       <w:color w:val="13304F"/>
-      <w:sz w:val="29"/>
-      <w:szCs w:val="29"/>
+      <w:sz w:val="24"/>
+      <w:szCs w:val="24"/>
     </w:rPr>
   </w:style>
 </w:styles>

</xml_diff>